<commit_message>
feat: translate rich career histories into complete resumes (v0.4.0)
</commit_message>
<xml_diff>
--- a/docs/assets/resume-templates/clean/sample.docx
+++ b/docs/assets/resume-templates/clean/sample.docx
@@ -5,7 +5,7 @@
     <w:p>
       <w:pPr>
         <w:pStyle w:val="Title"/>
-        <w:jc w:val="left"/>
+        <w:jc w:val="center"/>
       </w:pPr>
       <w:r>
         <w:t>林青</w:t>
@@ -14,6 +14,7 @@
     <w:p>
       <w:pPr>
         <w:pStyle w:val="Subtitle"/>
+        <w:jc w:val="center"/>
       </w:pPr>
       <w:r>
         <w:t>fictional@example.test</w:t>
@@ -21,15 +22,24 @@
     </w:p>
     <w:p>
       <w:pPr>
+        <w:pStyle w:val="Subtitle"/>
+        <w:jc w:val="center"/>
+      </w:pPr>
+      <w:r>
+        <w:t>申请方向：数据分析方向</w:t>
+      </w:r>
+    </w:p>
+    <w:p>
+      <w:pPr>
         <w:pStyle w:val="Heading1"/>
       </w:pPr>
       <w:r>
-        <w:t>个人简介</w:t>
+        <w:t>个人优势</w:t>
       </w:r>
     </w:p>
     <w:p>
       <w:r>
-        <w:t>虚构大学统计学专业应届毕业生，预计2026年毕业。熟悉 Python、Excel 数据处理，关注从数据清理到业务表达的完整流程。</w:t>
+        <w:t>熟悉 Python、Excel 数据处理，关注从数据清理到业务表达的完整流程</w:t>
       </w:r>
     </w:p>
     <w:p>
@@ -42,7 +52,7 @@
     </w:p>
     <w:p>
       <w:r>
-        <w:t>虚构大学 | 统计学学士 | 2022.09 - 2026.06</w:t>
+        <w:t>虚构大学 | 统计学学士 | 2022.09–2026.06</w:t>
       </w:r>
     </w:p>
     <w:p>
@@ -60,10 +70,24 @@
     </w:p>
     <w:p>
       <w:pPr>
-        <w:pStyle w:val="Heading1"/>
+        <w:pStyle w:val="Heading2"/>
       </w:pPr>
       <w:r>
         <w:t>校园出行问卷分析</w:t>
+      </w:r>
+    </w:p>
+    <w:p>
+      <w:pPr>
+        <w:keepNext/>
+        <w:spacing w:after="40"/>
+        <w:jc w:val="right"/>
+      </w:pPr>
+      <w:r>
+        <w:rPr>
+          <w:color w:val="646464"/>
+          <w:sz w:val="18"/>
+        </w:rPr>
+        <w:t>2025.03–2025.06</w:t>
       </w:r>
     </w:p>
     <w:p>
@@ -92,10 +116,24 @@
     </w:p>
     <w:p>
       <w:pPr>
-        <w:pStyle w:val="Heading1"/>
+        <w:pStyle w:val="Heading2"/>
       </w:pPr>
       <w:r>
         <w:t>课程图书借阅观察</w:t>
+      </w:r>
+    </w:p>
+    <w:p>
+      <w:pPr>
+        <w:keepNext/>
+        <w:spacing w:after="40"/>
+        <w:jc w:val="right"/>
+      </w:pPr>
+      <w:r>
+        <w:rPr>
+          <w:color w:val="646464"/>
+          <w:sz w:val="18"/>
+        </w:rPr>
+        <w:t>2024.09–2024.12</w:t>
       </w:r>
     </w:p>
     <w:p>
@@ -127,29 +165,20 @@
         <w:pStyle w:val="Heading1"/>
       </w:pPr>
       <w:r>
-        <w:t>技能</w:t>
+        <w:t>专业技能</w:t>
       </w:r>
     </w:p>
     <w:p>
-      <w:pPr>
-        <w:pStyle w:val="ListBullet"/>
-      </w:pPr>
       <w:r>
         <w:t>Python 数据清洗、分组汇总与图表制作</w:t>
       </w:r>
     </w:p>
     <w:p>
-      <w:pPr>
-        <w:pStyle w:val="ListBullet"/>
-      </w:pPr>
       <w:r>
         <w:t>Excel 数据透视表与数据核对</w:t>
       </w:r>
     </w:p>
     <w:p>
-      <w:pPr>
-        <w:pStyle w:val="ListBullet"/>
-      </w:pPr>
       <w:r>
         <w:t>结果说明与分析限制表达</w:t>
       </w:r>
@@ -159,13 +188,10 @@
         <w:pStyle w:val="Heading1"/>
       </w:pPr>
       <w:r>
-        <w:t>兴趣</w:t>
+        <w:t>个人兴趣</w:t>
       </w:r>
     </w:p>
     <w:p>
-      <w:pPr>
-        <w:pStyle w:val="ListBullet"/>
-      </w:pPr>
       <w:r>
         <w:t>徒步</w:t>
       </w:r>
@@ -544,7 +570,7 @@
     <w:qFormat/>
     <w:rsid w:val="00FC693F"/>
     <w:pPr>
-      <w:spacing w:line="283" w:lineRule="auto" w:after="40"/>
+      <w:spacing w:line="269" w:lineRule="auto" w:after="20"/>
     </w:pPr>
     <w:rPr>
       <w:rFonts w:ascii="Microsoft YaHei" w:hAnsi="Microsoft YaHei" w:eastAsia="Microsoft YaHei"/>
@@ -607,17 +633,17 @@
     <w:pPr>
       <w:keepNext/>
       <w:keepLines/>
-      <w:spacing w:before="180" w:after="60"/>
+      <w:spacing w:before="100" w:after="40"/>
       <w:outlineLvl w:val="0"/>
       <w:pBdr>
-        <w:bottom w:val="single" w:sz="4" w:space="2" w:color="354B5E"/>
+        <w:bottom w:val="single" w:sz="4" w:space="2" w:color="B7B7B7"/>
       </w:pBdr>
     </w:pPr>
     <w:rPr>
       <w:rFonts w:asciiTheme="majorHAnsi" w:eastAsiaTheme="majorEastAsia" w:hAnsiTheme="majorHAnsi" w:cstheme="majorBidi" w:ascii="Microsoft YaHei" w:hAnsi="Microsoft YaHei" w:eastAsia="Microsoft YaHei"/>
       <w:b/>
       <w:bCs/>
-      <w:color w:val="354B5E"/>
+      <w:color w:val="000000"/>
       <w:sz w:val="25"/>
       <w:szCs w:val="28"/>
     </w:rPr>
@@ -634,15 +660,15 @@
     <w:pPr>
       <w:keepNext/>
       <w:keepLines/>
-      <w:spacing w:before="200" w:after="0"/>
+      <w:spacing w:before="100" w:after="0"/>
       <w:outlineLvl w:val="1"/>
     </w:pPr>
     <w:rPr>
-      <w:rFonts w:asciiTheme="majorHAnsi" w:eastAsiaTheme="majorEastAsia" w:hAnsiTheme="majorHAnsi" w:cstheme="majorBidi"/>
+      <w:rFonts w:asciiTheme="majorHAnsi" w:eastAsiaTheme="majorEastAsia" w:hAnsiTheme="majorHAnsi" w:cstheme="majorBidi" w:ascii="Microsoft YaHei" w:hAnsi="Microsoft YaHei" w:eastAsia="Microsoft YaHei"/>
       <w:b/>
       <w:bCs/>
-      <w:color w:val="4F81BD" w:themeColor="accent1"/>
-      <w:sz w:val="26"/>
+      <w:color w:val="000000"/>
+      <w:sz w:val="21"/>
       <w:szCs w:val="26"/>
     </w:rPr>
   </w:style>
@@ -901,6 +927,7 @@
     </w:pPr>
     <w:rPr>
       <w:rFonts w:asciiTheme="majorHAnsi" w:eastAsiaTheme="majorEastAsia" w:hAnsiTheme="majorHAnsi" w:cstheme="majorBidi" w:ascii="Microsoft YaHei" w:hAnsi="Microsoft YaHei" w:eastAsia="Microsoft YaHei"/>
+      <w:b/>
       <w:color w:val="000000"/>
       <w:spacing w:val="5"/>
       <w:kern w:val="28"/>
@@ -938,11 +965,11 @@
     </w:pPr>
     <w:rPr>
       <w:rFonts w:asciiTheme="majorHAnsi" w:eastAsiaTheme="majorEastAsia" w:hAnsiTheme="majorHAnsi" w:cstheme="majorBidi" w:ascii="Microsoft YaHei" w:hAnsi="Microsoft YaHei" w:eastAsia="Microsoft YaHei"/>
-      <w:i/>
+      <w:i w:val="0"/>
       <w:iCs/>
       <w:color w:val="000000"/>
       <w:spacing w:val="15"/>
-      <w:sz w:val="24"/>
+      <w:sz w:val="20"/>
       <w:szCs w:val="24"/>
     </w:rPr>
   </w:style>

</xml_diff>